<commit_message>
Updated bibliography after meeting
</commit_message>
<xml_diff>
--- a/meetingNotes/Bibliography_SimFrameworksDatasets.docx
+++ b/meetingNotes/Bibliography_SimFrameworksDatasets.docx
@@ -92,6 +92,7 @@
         <w:spacing w:after="80"/>
       </w:pPr>
       <w:commentRangeStart w:id="0"/>
+      <w:commentRangeStart w:id="1"/>
       <w:r>
         <w:rPr>
           <w:b/>
@@ -138,6 +139,15 @@
         </w:rPr>
         <w:commentReference w:id="0"/>
       </w:r>
+      <w:commentRangeEnd w:id="1"/>
+      <w:r>
+        <w:rPr>
+          <w:rStyle w:val="CommentReference"/>
+          <w:sz w:val="20"/>
+          <w:szCs w:val="20"/>
+        </w:rPr>
+        <w:commentReference w:id="1"/>
+      </w:r>
     </w:p>
     <w:p>
       <w:pPr>
@@ -177,18 +187,18 @@
       <w:pPr>
         <w:spacing w:after="240"/>
       </w:pPr>
-      <w:commentRangeStart w:id="1"/>
+      <w:commentRangeStart w:id="2"/>
       <w:r>
         <w:t>This is the paper that most threatens our proposal as originally scoped, not just the logging half of it. Their Section 9 says they are already running controlled fault injections (active FDI, targeted GNSS spoofing, computational-load variation) across dozens of repeated real and simulated flights specifically to build a labeled attack dataset and a lightweight IDS trained on it — attack injection into PX4 simulation, full telemetry capture, labeled vulnerability dataset, exploration tool: the same four nouns as our proposal. The logging pipeline itself is already built and published (pyulog → CSV → pandas, phase-locked cross-flight alignment keyed to mission-item state transitions rather than wall-clock time, RMSE/variance/JSD/FFT metrics). If our contribution is “full telemetry logging,” that piece is done. We need to differentiate at the injection/dataset layer, or push into the ROS 2/DDS layer this paper doesn't touch (it logs PX4's own uORB bus, not the ROS 2 graph sitting on top of it).</w:t>
       </w:r>
-      <w:commentRangeEnd w:id="1"/>
+      <w:commentRangeEnd w:id="2"/>
       <w:r>
         <w:rPr>
           <w:rStyle w:val="CommentReference"/>
           <w:sz w:val="20"/>
           <w:szCs w:val="20"/>
         </w:rPr>
-        <w:commentReference w:id="1"/>
+        <w:commentReference w:id="2"/>
       </w:r>
     </w:p>
     <w:p>
@@ -409,7 +419,23 @@
       </w:r>
     </w:p>
   </w:comment>
-  <w:comment w:id="1" w:author="Liam Degand" w:date="2026-09-08T14:59:00Z" w:initials="LD">
+  <w:comment w:id="1" w:author="Liam Degand" w:date="2026-09-08T15:37:00Z" w:initials="LD">
+    <w:p>
+      <w:pPr>
+        <w:pStyle w:val="CommentText"/>
+      </w:pPr>
+      <w:r>
+        <w:rPr>
+          <w:rStyle w:val="CommentReference"/>
+        </w:rPr>
+        <w:annotationRef/>
+      </w:r>
+      <w:r>
+        <w:t>We can differentiate by using other attack models. For example injection, etc...</w:t>
+      </w:r>
+    </w:p>
+  </w:comment>
+  <w:comment w:id="2" w:author="Liam Degand" w:date="2026-09-08T14:59:00Z" w:initials="LD">
     <w:p>
       <w:pPr>
         <w:pStyle w:val="CommentText"/>
@@ -431,6 +457,7 @@
 <file path=word/commentsExtended.xml><?xml version="1.0" encoding="utf-8"?>
 <w15:commentsEx xmlns:wpc="http://schemas.microsoft.com/office/word/2010/wordprocessingCanvas" xmlns:cx="http://schemas.microsoft.com/office/drawing/2014/chartex" xmlns:cx1="http://schemas.microsoft.com/office/drawing/2015/9/8/chartex" xmlns:cx2="http://schemas.microsoft.com/office/drawing/2015/10/21/chartex" xmlns:cx3="http://schemas.microsoft.com/office/drawing/2016/5/9/chartex" xmlns:cx4="http://schemas.microsoft.com/office/drawing/2016/5/10/chartex" xmlns:cx5="http://schemas.microsoft.com/office/drawing/2016/5/11/chartex" xmlns:cx6="http://schemas.microsoft.com/office/drawing/2016/5/12/chartex" xmlns:cx7="http://schemas.microsoft.com/office/drawing/2016/5/13/chartex" xmlns:cx8="http://schemas.microsoft.com/office/drawing/2016/5/14/chartex" xmlns:mc="http://schemas.openxmlformats.org/markup-compatibility/2006" xmlns:aink="http://schemas.microsoft.com/office/drawing/2016/ink" xmlns:am3d="http://schemas.microsoft.com/office/drawing/2017/model3d" xmlns:o="urn:schemas-microsoft-com:office:office" xmlns:oel="http://schemas.microsoft.com/office/2019/extlst" xmlns:r="http://schemas.openxmlformats.org/officeDocument/2006/relationships" xmlns:m="http://schemas.openxmlformats.org/officeDocument/2006/math" xmlns:v="urn:schemas-microsoft-com:vml" xmlns:wp14="http://schemas.microsoft.com/office/word/2010/wordprocessingDrawing" xmlns:wp="http://schemas.openxmlformats.org/drawingml/2006/wordprocessingDrawing" xmlns:w10="urn:schemas-microsoft-com:office:word" xmlns:w="http://schemas.openxmlformats.org/wordprocessingml/2006/main" xmlns:w14="http://schemas.microsoft.com/office/word/2010/wordml" xmlns:w15="http://schemas.microsoft.com/office/word/2012/wordml" xmlns:w16cei="http://schemas.microsoft.com/office/word/2026/wordml/cei" xmlns:w16cex="http://schemas.microsoft.com/office/word/2018/wordml/cex" xmlns:w16cid="http://schemas.microsoft.com/office/word/2016/wordml/cid" xmlns:w16="http://schemas.microsoft.com/office/word/2018/wordml" xmlns:w16du="http://schemas.microsoft.com/office/word/2023/wordml/word16du" xmlns:w16sdtdh="http://schemas.microsoft.com/office/word/2020/wordml/sdtdatahash" xmlns:w16sdtfl="http://schemas.microsoft.com/office/word/2024/wordml/sdtformatlock" xmlns:w16se="http://schemas.microsoft.com/office/word/2015/wordml/symex" xmlns:wpg="http://schemas.microsoft.com/office/word/2010/wordprocessingGroup" xmlns:wpi="http://schemas.microsoft.com/office/word/2010/wordprocessingInk" xmlns:wne="http://schemas.microsoft.com/office/word/2006/wordml" xmlns:wps="http://schemas.microsoft.com/office/word/2010/wordprocessingShape" mc:Ignorable="w14 w15 w16se w16cid w16 w16cex w16sdtdh w16sdtfl w16du wp14">
   <w15:commentEx w15:paraId="48A96336" w15:done="0"/>
+  <w15:commentEx w15:paraId="0C776BBB" w15:paraIdParent="48A96336" w15:done="0"/>
   <w15:commentEx w15:paraId="12D40B1E" w15:done="0"/>
 </w15:commentsEx>
 </file>
@@ -438,6 +465,7 @@
 <file path=word/commentsExtensible.xml><?xml version="1.0" encoding="utf-8"?>
 <w16cex:commentsExtensible xmlns:wpc="http://schemas.microsoft.com/office/word/2010/wordprocessingCanvas" xmlns:cx="http://schemas.microsoft.com/office/drawing/2014/chartex" xmlns:cx1="http://schemas.microsoft.com/office/drawing/2015/9/8/chartex" xmlns:cx2="http://schemas.microsoft.com/office/drawing/2015/10/21/chartex" xmlns:cx3="http://schemas.microsoft.com/office/drawing/2016/5/9/chartex" xmlns:cx4="http://schemas.microsoft.com/office/drawing/2016/5/10/chartex" xmlns:cx5="http://schemas.microsoft.com/office/drawing/2016/5/11/chartex" xmlns:cx6="http://schemas.microsoft.com/office/drawing/2016/5/12/chartex" xmlns:cx7="http://schemas.microsoft.com/office/drawing/2016/5/13/chartex" xmlns:cx8="http://schemas.microsoft.com/office/drawing/2016/5/14/chartex" xmlns:cr="http://schemas.microsoft.com/office/comments/2020/reactions" xmlns:mc="http://schemas.openxmlformats.org/markup-compatibility/2006" xmlns:aink="http://schemas.microsoft.com/office/drawing/2016/ink" xmlns:am3d="http://schemas.microsoft.com/office/drawing/2017/model3d" xmlns:o="urn:schemas-microsoft-com:office:office" xmlns:oel="http://schemas.microsoft.com/office/2019/extlst" xmlns:r="http://schemas.openxmlformats.org/officeDocument/2006/relationships" xmlns:m="http://schemas.openxmlformats.org/officeDocument/2006/math" xmlns:v="urn:schemas-microsoft-com:vml" xmlns:wp14="http://schemas.microsoft.com/office/word/2010/wordprocessingDrawing" xmlns:wp="http://schemas.openxmlformats.org/drawingml/2006/wordprocessingDrawing" xmlns:w10="urn:schemas-microsoft-com:office:word" xmlns:w="http://schemas.openxmlformats.org/wordprocessingml/2006/main" xmlns:w14="http://schemas.microsoft.com/office/word/2010/wordml" xmlns:w15="http://schemas.microsoft.com/office/word/2012/wordml" xmlns:w16cei="http://schemas.microsoft.com/office/word/2026/wordml/cei" xmlns:w16cex="http://schemas.microsoft.com/office/word/2018/wordml/cex" xmlns:w16cid="http://schemas.microsoft.com/office/word/2016/wordml/cid" xmlns:w16="http://schemas.microsoft.com/office/word/2018/wordml" xmlns:w16du="http://schemas.microsoft.com/office/word/2023/wordml/word16du" xmlns:w16sdtdh="http://schemas.microsoft.com/office/word/2020/wordml/sdtdatahash" xmlns:w16sdtfl="http://schemas.microsoft.com/office/word/2024/wordml/sdtformatlock" xmlns:w16se="http://schemas.microsoft.com/office/word/2015/wordml/symex" xmlns:wpg="http://schemas.microsoft.com/office/word/2010/wordprocessingGroup" xmlns:wpi="http://schemas.microsoft.com/office/word/2010/wordprocessingInk" xmlns:wne="http://schemas.microsoft.com/office/word/2006/wordml" xmlns:wps="http://schemas.microsoft.com/office/word/2010/wordprocessingShape" mc:Ignorable="w14 w15 w16se w16cid w16 w16cex w16sdtdh w16sdtfl cr w16du wp14">
   <w16cex:commentExtensible w16cex:durableId="41D311E6" w16cex:dateUtc="2026-09-08T04:58:00Z"/>
+  <w16cex:commentExtensible w16cex:durableId="06282C4C" w16cex:dateUtc="2026-09-08T05:37:00Z"/>
   <w16cex:commentExtensible w16cex:durableId="6D19EB9A" w16cex:dateUtc="2026-09-08T04:59:00Z"/>
 </w16cex:commentsExtensible>
 </file>
@@ -445,6 +473,7 @@
 <file path=word/commentsIds.xml><?xml version="1.0" encoding="utf-8"?>
 <w16cid:commentsIds xmlns:wpc="http://schemas.microsoft.com/office/word/2010/wordprocessingCanvas" xmlns:cx="http://schemas.microsoft.com/office/drawing/2014/chartex" xmlns:cx1="http://schemas.microsoft.com/office/drawing/2015/9/8/chartex" xmlns:cx2="http://schemas.microsoft.com/office/drawing/2015/10/21/chartex" xmlns:cx3="http://schemas.microsoft.com/office/drawing/2016/5/9/chartex" xmlns:cx4="http://schemas.microsoft.com/office/drawing/2016/5/10/chartex" xmlns:cx5="http://schemas.microsoft.com/office/drawing/2016/5/11/chartex" xmlns:cx6="http://schemas.microsoft.com/office/drawing/2016/5/12/chartex" xmlns:cx7="http://schemas.microsoft.com/office/drawing/2016/5/13/chartex" xmlns:cx8="http://schemas.microsoft.com/office/drawing/2016/5/14/chartex" xmlns:mc="http://schemas.openxmlformats.org/markup-compatibility/2006" xmlns:aink="http://schemas.microsoft.com/office/drawing/2016/ink" xmlns:am3d="http://schemas.microsoft.com/office/drawing/2017/model3d" xmlns:o="urn:schemas-microsoft-com:office:office" xmlns:oel="http://schemas.microsoft.com/office/2019/extlst" xmlns:r="http://schemas.openxmlformats.org/officeDocument/2006/relationships" xmlns:m="http://schemas.openxmlformats.org/officeDocument/2006/math" xmlns:v="urn:schemas-microsoft-com:vml" xmlns:wp14="http://schemas.microsoft.com/office/word/2010/wordprocessingDrawing" xmlns:wp="http://schemas.openxmlformats.org/drawingml/2006/wordprocessingDrawing" xmlns:w10="urn:schemas-microsoft-com:office:word" xmlns:w="http://schemas.openxmlformats.org/wordprocessingml/2006/main" xmlns:w14="http://schemas.microsoft.com/office/word/2010/wordml" xmlns:w15="http://schemas.microsoft.com/office/word/2012/wordml" xmlns:w16cei="http://schemas.microsoft.com/office/word/2026/wordml/cei" xmlns:w16cex="http://schemas.microsoft.com/office/word/2018/wordml/cex" xmlns:w16cid="http://schemas.microsoft.com/office/word/2016/wordml/cid" xmlns:w16="http://schemas.microsoft.com/office/word/2018/wordml" xmlns:w16du="http://schemas.microsoft.com/office/word/2023/wordml/word16du" xmlns:w16sdtdh="http://schemas.microsoft.com/office/word/2020/wordml/sdtdatahash" xmlns:w16sdtfl="http://schemas.microsoft.com/office/word/2024/wordml/sdtformatlock" xmlns:w16se="http://schemas.microsoft.com/office/word/2015/wordml/symex" xmlns:wpg="http://schemas.microsoft.com/office/word/2010/wordprocessingGroup" xmlns:wpi="http://schemas.microsoft.com/office/word/2010/wordprocessingInk" xmlns:wne="http://schemas.microsoft.com/office/word/2006/wordml" xmlns:wps="http://schemas.microsoft.com/office/word/2010/wordprocessingShape" mc:Ignorable="w14 w15 w16se w16cid w16 w16cex w16sdtdh w16sdtfl w16du wp14">
   <w16cid:commentId w16cid:paraId="48A96336" w16cid:durableId="41D311E6"/>
+  <w16cid:commentId w16cid:paraId="0C776BBB" w16cid:durableId="06282C4C"/>
   <w16cid:commentId w16cid:paraId="12D40B1E" w16cid:durableId="6D19EB9A"/>
 </w16cid:commentsIds>
 </file>

</xml_diff>